<commit_message>
AppSheet/GAS: add GAS HTML web-app usage and revise the AppSheet vs GAS comparison
Co-Authored-By: Claude Opus 4.8 <noreply@anthropic.com>
Claude-Session: https://claude.ai/code/session_01WGUn1J3fxuGWWpXYD7VtbD
</commit_message>
<xml_diff>
--- a/docx出力/AppSheetとGASでの業務アプリ作成.docx
+++ b/docx出力/AppSheetとGASでの業務アプリ作成.docx
@@ -2,7 +2,7 @@
 <file path=word/document.xml><?xml version="1.0" encoding="utf-8"?>
 <w:document xmlns:w="http://schemas.openxmlformats.org/wordprocessingml/2006/main" xmlns:m="http://schemas.openxmlformats.org/officeDocument/2006/math" xmlns:r="http://schemas.openxmlformats.org/officeDocument/2006/relationships" xmlns:o="urn:schemas-microsoft-com:office:office" xmlns:v="urn:schemas-microsoft-com:vml" xmlns:w10="urn:schemas-microsoft-com:office:word" xmlns:a="http://schemas.openxmlformats.org/drawingml/2006/main" xmlns:pic="http://schemas.openxmlformats.org/drawingml/2006/picture" xmlns:wp="http://schemas.openxmlformats.org/drawingml/2006/wordprocessingDrawing">
   <w:body>
-    <w:bookmarkStart w:id="38" w:name="X014f593db4da756a3d86bc2f2da34fc8fc60def"/>
+    <w:bookmarkStart w:id="41" w:name="X014f593db4da756a3d86bc2f2da34fc8fc60def"/>
     <w:p>
       <w:pPr>
         <w:pStyle w:val="Heading1"/>
@@ -152,7 +152,17 @@
         <w:t xml:space="preserve">GAS は「JavaScript で」Google のアプリ同士を自動連携させる</w:t>
       </w:r>
       <w:r>
-        <w:t xml:space="preserve">（定型メール送信・集計・通知など）</w:t>
+        <w:t xml:space="preserve">（定型メール送信・集計・通知など）だけでなく、</w:t>
+      </w:r>
+      <w:r>
+        <w:rPr>
+          <w:bCs/>
+          <w:b/>
+        </w:rPr>
+        <w:t xml:space="preserve">HTML で画面を作って「Web アプリ」として公開する</w:t>
+      </w:r>
+      <w:r>
+        <w:t xml:space="preserve">こともできる（独自の入力フォームや社内ツールなど）</w:t>
       </w:r>
     </w:p>
     <w:p>
@@ -225,7 +235,7 @@
       </w:r>
     </w:p>
     <w:bookmarkEnd w:id="20"/>
-    <w:bookmarkStart w:id="30" w:name="X6c5f21f2d054bba204480df736f2ecafdbe8267"/>
+    <w:bookmarkStart w:id="33" w:name="X6c5f21f2d054bba204480df736f2ecafdbe8267"/>
     <w:p>
       <w:pPr>
         <w:pStyle w:val="Heading2"/>
@@ -683,13 +693,13 @@
       </w:r>
     </w:p>
     <w:bookmarkEnd w:id="23"/>
-    <w:bookmarkStart w:id="24" w:name="X1243467dad2a92f64b69877650c3b6bed41e6a5"/>
+    <w:bookmarkStart w:id="26" w:name="X5711593349b8e5b5f221721bd464b13f4e12d59"/>
     <w:p>
       <w:pPr>
         <w:pStyle w:val="Heading3"/>
       </w:pPr>
       <w:r>
-        <w:t xml:space="preserve">2-3. Google Apps Script（GAS）とは（Google アプリを自動化する）</w:t>
+        <w:t xml:space="preserve">2-3. Google Apps Script（GAS）とは（自動化＋HTML の Web アプリ）</w:t>
       </w:r>
     </w:p>
     <w:p>
@@ -717,7 +727,39 @@
         <w:t xml:space="preserve">JavaScript を使って Google Workspace の各アプリを操作・連携させる</w:t>
       </w:r>
       <w:r>
-        <w:t xml:space="preserve">プログラミング環境です。ブラウザだけで書けて、サーバー準備は不要です。</w:t>
+        <w:t xml:space="preserve">プログラミング環境です。ブラウザだけで書けて、サーバー準備は不要です。用途は大きく</w:t>
+      </w:r>
+      <w:r>
+        <w:t xml:space="preserve"> </w:t>
+      </w:r>
+      <w:r>
+        <w:rPr>
+          <w:bCs/>
+          <w:b/>
+        </w:rPr>
+        <w:t xml:space="preserve">(A) 自動化</w:t>
+      </w:r>
+      <w:r>
+        <w:t xml:space="preserve"> </w:t>
+      </w:r>
+      <w:r>
+        <w:t xml:space="preserve">と</w:t>
+      </w:r>
+      <w:r>
+        <w:t xml:space="preserve"> </w:t>
+      </w:r>
+      <w:r>
+        <w:rPr>
+          <w:bCs/>
+          <w:b/>
+        </w:rPr>
+        <w:t xml:space="preserve">(B) HTML で作る Web アプリ</w:t>
+      </w:r>
+      <w:r>
+        <w:t xml:space="preserve"> </w:t>
+      </w:r>
+      <w:r>
+        <w:t xml:space="preserve">の 2 つがあります。</w:t>
       </w:r>
     </w:p>
     <w:tbl>
@@ -785,7 +827,23 @@
               <w:jc w:val="left"/>
             </w:pPr>
             <w:r>
-              <w:t xml:space="preserve">JavaScript ベースの独自スクリプト</w:t>
+              <w:t xml:space="preserve">JavaScript ベースの独自スクリプト（画面は</w:t>
+            </w:r>
+            <w:r>
+              <w:t xml:space="preserve"> </w:t>
+            </w:r>
+            <w:r>
+              <w:rPr>
+                <w:bCs/>
+                <w:b/>
+              </w:rPr>
+              <w:t xml:space="preserve">HTML／CSS</w:t>
+            </w:r>
+            <w:r>
+              <w:t xml:space="preserve"> </w:t>
+            </w:r>
+            <w:r>
+              <w:t xml:space="preserve">で作成）</w:t>
             </w:r>
           </w:p>
         </w:tc>
@@ -845,7 +903,20 @@
               <w:jc w:val="left"/>
             </w:pPr>
             <w:r>
-              <w:t xml:space="preserve">手動実行、時間主導（毎日◯時など）、フォーム送信時、シート編集時 など</w:t>
+              <w:t xml:space="preserve">手動実行、時間主導（毎日◯時など）、フォーム送信時、シート編集時、</w:t>
+            </w:r>
+            <w:r>
+              <w:rPr>
+                <w:bCs/>
+                <w:b/>
+              </w:rPr>
+              <w:t xml:space="preserve">Web アプリの URL アクセス時</w:t>
+            </w:r>
+            <w:r>
+              <w:t xml:space="preserve"> </w:t>
+            </w:r>
+            <w:r>
+              <w:t xml:space="preserve">など</w:t>
             </w:r>
           </w:p>
         </w:tc>
@@ -875,22 +946,34 @@
               <w:jc w:val="left"/>
             </w:pPr>
             <w:r>
-              <w:t xml:space="preserve">定型作業の自動化、集計、定期メール／通知、アプリ間のデータ連携</w:t>
+              <w:t xml:space="preserve">定型作業の自動化、集計、定期メール／通知、アプリ間のデータ連携、</w:t>
+            </w:r>
+            <w:r>
+              <w:rPr>
+                <w:bCs/>
+                <w:b/>
+              </w:rPr>
+              <w:t xml:space="preserve">独自 UI の簡易 Web アプリ</w:t>
             </w:r>
           </w:p>
         </w:tc>
       </w:tr>
     </w:tbl>
-    <w:p>
-      <w:pPr>
-        <w:pStyle w:val="BodyText"/>
-      </w:pPr>
-      <w:r>
-        <w:rPr>
-          <w:bCs/>
-          <w:b/>
-        </w:rPr>
-        <w:t xml:space="preserve">向いている業務の例</w:t>
+    <w:bookmarkStart w:id="24" w:name="a-自動化としての-gas"/>
+    <w:p>
+      <w:pPr>
+        <w:pStyle w:val="Heading4"/>
+      </w:pPr>
+      <w:r>
+        <w:t xml:space="preserve">(A) 自動化としての GAS</w:t>
+      </w:r>
+    </w:p>
+    <w:p>
+      <w:pPr>
+        <w:pStyle w:val="FirstParagraph"/>
+      </w:pPr>
+      <w:r>
+        <w:t xml:space="preserve">Google のアプリ同士を裏側でつなぎ、定型作業を自動で動かす使い方です。</w:t>
       </w:r>
     </w:p>
     <w:p>
@@ -960,13 +1043,77 @@
       </w:r>
     </w:p>
     <w:bookmarkEnd w:id="24"/>
-    <w:bookmarkStart w:id="25" w:name="X2ae4e3025aa2b09eb702a3e43d933f18d654544"/>
-    <w:p>
-      <w:pPr>
-        <w:pStyle w:val="Heading3"/>
-      </w:pPr>
-      <w:r>
-        <w:t xml:space="preserve">2-4. GAS を書く大まかな手順</w:t>
+    <w:bookmarkStart w:id="25" w:name="b-html-の-web-アプリとしての-gas"/>
+    <w:p>
+      <w:pPr>
+        <w:pStyle w:val="Heading4"/>
+      </w:pPr>
+      <w:r>
+        <w:t xml:space="preserve">(B) HTML の Web アプリとしての GAS</w:t>
+      </w:r>
+    </w:p>
+    <w:p>
+      <w:pPr>
+        <w:pStyle w:val="FirstParagraph"/>
+      </w:pPr>
+      <w:r>
+        <w:t xml:space="preserve">GAS は、</w:t>
+      </w:r>
+      <w:r>
+        <w:rPr>
+          <w:bCs/>
+          <w:b/>
+        </w:rPr>
+        <w:t xml:space="preserve">HTML／CSS で自作した画面（</w:t>
+      </w:r>
+      <w:r>
+        <w:rPr>
+          <w:rStyle w:val="VerbatimChar"/>
+          <w:bCs/>
+          <w:b/>
+        </w:rPr>
+        <w:t xml:space="preserve">HtmlService</w:t>
+      </w:r>
+      <w:r>
+        <w:rPr>
+          <w:bCs/>
+          <w:b/>
+        </w:rPr>
+        <w:t xml:space="preserve">）を「Web アプリ」として URL 公開</w:t>
+      </w:r>
+      <w:r>
+        <w:t xml:space="preserve">できます。</w:t>
+      </w:r>
+      <w:r>
+        <w:rPr>
+          <w:rStyle w:val="VerbatimChar"/>
+        </w:rPr>
+        <w:t xml:space="preserve">doGet</w:t>
+      </w:r>
+      <w:r>
+        <w:t xml:space="preserve">／</w:t>
+      </w:r>
+      <w:r>
+        <w:rPr>
+          <w:rStyle w:val="VerbatimChar"/>
+        </w:rPr>
+        <w:t xml:space="preserve">doPost</w:t>
+      </w:r>
+      <w:r>
+        <w:t xml:space="preserve"> </w:t>
+      </w:r>
+      <w:r>
+        <w:t xml:space="preserve">という関数で画面や処理を返し、利用者はブラウザからその URL を開いて使います。</w:t>
+      </w:r>
+      <w:r>
+        <w:rPr>
+          <w:bCs/>
+          <w:b/>
+        </w:rPr>
+        <w:t xml:space="preserve">AppSheet では作りにくい独自レイアウトの画面や、細かい入力チェック・独自ロジックを持つ社内ツール</w:t>
+      </w:r>
+      <w:r>
+        <w:t xml:space="preserve">を作れるのが特長です。</w:t>
       </w:r>
     </w:p>
     <w:p>
@@ -978,23 +1125,14 @@
         <w:pStyle w:val="Compact"/>
       </w:pPr>
       <w:r>
-        <w:t xml:space="preserve">スプレッドシートを開き、メニューの</w:t>
-      </w:r>
-      <w:r>
-        <w:t xml:space="preserve"> </w:t>
-      </w:r>
-      <w:r>
-        <w:rPr>
-          <w:bCs/>
-          <w:b/>
-        </w:rPr>
-        <w:t xml:space="preserve">「拡張機能」→「Apps Script」</w:t>
-      </w:r>
-      <w:r>
-        <w:t xml:space="preserve"> </w:t>
-      </w:r>
-      <w:r>
-        <w:t xml:space="preserve">を開く</w:t>
+        <w:rPr>
+          <w:bCs/>
+          <w:b/>
+        </w:rPr>
+        <w:t xml:space="preserve">独自デザインの入力フォーム／申請画面</w:t>
+      </w:r>
+      <w:r>
+        <w:t xml:space="preserve">（スプレッドシートを裏側の台帳にする）</w:t>
       </w:r>
     </w:p>
     <w:p>
@@ -1006,7 +1144,17 @@
         <w:pStyle w:val="Compact"/>
       </w:pPr>
       <w:r>
-        <w:t xml:space="preserve">エディタでスクリプト（関数）を書く</w:t>
+        <w:t xml:space="preserve">スプレッドシートのデータを見せる</w:t>
+      </w:r>
+      <w:r>
+        <w:t xml:space="preserve"> </w:t>
+      </w:r>
+      <w:r>
+        <w:rPr>
+          <w:bCs/>
+          <w:b/>
+        </w:rPr>
+        <w:t xml:space="preserve">簡易ダッシュボード・検索画面</w:t>
       </w:r>
     </w:p>
     <w:p>
@@ -1018,6 +1166,129 @@
         <w:pStyle w:val="Compact"/>
       </w:pPr>
       <w:r>
+        <w:t xml:space="preserve">既存の Google アプリでは作りにくい</w:t>
+      </w:r>
+      <w:r>
+        <w:t xml:space="preserve"> </w:t>
+      </w:r>
+      <w:r>
+        <w:rPr>
+          <w:bCs/>
+          <w:b/>
+        </w:rPr>
+        <w:t xml:space="preserve">専用の社内ツール</w:t>
+      </w:r>
+      <w:r>
+        <w:t xml:space="preserve">（バーコード入力受付、簡易予約など）</w:t>
+      </w:r>
+    </w:p>
+    <w:p>
+      <w:pPr>
+        <w:pStyle w:val="BlockText"/>
+      </w:pPr>
+      <w:r>
+        <w:t xml:space="preserve">💡</w:t>
+      </w:r>
+      <w:r>
+        <w:t xml:space="preserve"> </w:t>
+      </w:r>
+      <w:r>
+        <w:rPr>
+          <w:bCs/>
+          <w:b/>
+        </w:rPr>
+        <w:t xml:space="preserve">公開手順の概要</w:t>
+      </w:r>
+      <w:r>
+        <w:t xml:space="preserve">：エディタ右上の</w:t>
+      </w:r>
+      <w:r>
+        <w:t xml:space="preserve"> </w:t>
+      </w:r>
+      <w:r>
+        <w:rPr>
+          <w:bCs/>
+          <w:b/>
+        </w:rPr>
+        <w:t xml:space="preserve">「デプロイ」→「新しいデプロイ」→種類「ウェブアプリ」</w:t>
+      </w:r>
+      <w:r>
+        <w:t xml:space="preserve"> </w:t>
+      </w:r>
+      <w:r>
+        <w:t xml:space="preserve">を選び、「アクセスできるユーザー」を指定して公開すると URL が発行されます。</w:t>
+      </w:r>
+      <w:r>
+        <w:rPr>
+          <w:bCs/>
+          <w:b/>
+        </w:rPr>
+        <w:t xml:space="preserve">このアクセス範囲の設定を誤ると情報漏えいにつながる</w:t>
+      </w:r>
+      <w:r>
+        <w:t xml:space="preserve">ため、必ず「3. 社内ルール」のアクセス制限に従ってください。</w:t>
+      </w:r>
+    </w:p>
+    <w:bookmarkEnd w:id="25"/>
+    <w:bookmarkEnd w:id="26"/>
+    <w:bookmarkStart w:id="27" w:name="X2ae4e3025aa2b09eb702a3e43d933f18d654544"/>
+    <w:p>
+      <w:pPr>
+        <w:pStyle w:val="Heading3"/>
+      </w:pPr>
+      <w:r>
+        <w:t xml:space="preserve">2-4. GAS を書く大まかな手順</w:t>
+      </w:r>
+    </w:p>
+    <w:p>
+      <w:pPr>
+        <w:numPr>
+          <w:ilvl w:val="0"/>
+          <w:numId w:val="1006"/>
+        </w:numPr>
+        <w:pStyle w:val="Compact"/>
+      </w:pPr>
+      <w:r>
+        <w:t xml:space="preserve">スプレッドシートを開き、メニューの</w:t>
+      </w:r>
+      <w:r>
+        <w:t xml:space="preserve"> </w:t>
+      </w:r>
+      <w:r>
+        <w:rPr>
+          <w:bCs/>
+          <w:b/>
+        </w:rPr>
+        <w:t xml:space="preserve">「拡張機能」→「Apps Script」</w:t>
+      </w:r>
+      <w:r>
+        <w:t xml:space="preserve"> </w:t>
+      </w:r>
+      <w:r>
+        <w:t xml:space="preserve">を開く</w:t>
+      </w:r>
+    </w:p>
+    <w:p>
+      <w:pPr>
+        <w:numPr>
+          <w:ilvl w:val="0"/>
+          <w:numId w:val="1006"/>
+        </w:numPr>
+        <w:pStyle w:val="Compact"/>
+      </w:pPr>
+      <w:r>
+        <w:t xml:space="preserve">エディタでスクリプト（関数）を書く</w:t>
+      </w:r>
+    </w:p>
+    <w:p>
+      <w:pPr>
+        <w:numPr>
+          <w:ilvl w:val="0"/>
+          <w:numId w:val="1006"/>
+        </w:numPr>
+        <w:pStyle w:val="Compact"/>
+      </w:pPr>
+      <w:r>
         <w:t xml:space="preserve">書いたコードは、</w:t>
       </w:r>
       <w:r>
@@ -1035,7 +1306,7 @@
       <w:pPr>
         <w:numPr>
           <w:ilvl w:val="0"/>
-          <w:numId w:val="1005"/>
+          <w:numId w:val="1006"/>
         </w:numPr>
         <w:pStyle w:val="Compact"/>
       </w:pPr>
@@ -1067,12 +1338,31 @@
       <w:pPr>
         <w:numPr>
           <w:ilvl w:val="0"/>
-          <w:numId w:val="1005"/>
-        </w:numPr>
-        <w:pStyle w:val="Compact"/>
-      </w:pPr>
-      <w:r>
-        <w:t xml:space="preserve">定期実行したい場合は、左メニューの</w:t>
+          <w:numId w:val="1006"/>
+        </w:numPr>
+        <w:pStyle w:val="Compact"/>
+      </w:pPr>
+      <w:r>
+        <w:t xml:space="preserve">用途に応じて公開・実行方法を選ぶ</w:t>
+      </w:r>
+    </w:p>
+    <w:p>
+      <w:pPr>
+        <w:numPr>
+          <w:ilvl w:val="1"/>
+          <w:numId w:val="1007"/>
+        </w:numPr>
+        <w:pStyle w:val="Compact"/>
+      </w:pPr>
+      <w:r>
+        <w:rPr>
+          <w:bCs/>
+          <w:b/>
+        </w:rPr>
+        <w:t xml:space="preserve">自動化として使う場合</w:t>
+      </w:r>
+      <w:r>
+        <w:t xml:space="preserve">：左メニューの</w:t>
       </w:r>
       <w:r>
         <w:t xml:space="preserve"> </w:t>
@@ -1088,14 +1378,89 @@
         <w:t xml:space="preserve"> </w:t>
       </w:r>
       <w:r>
-        <w:t xml:space="preserve">で実行タイミングを設定する</w:t>
+        <w:t xml:space="preserve">で実行タイミング（毎日◯時、フォーム送信時など）を設定する</w:t>
+      </w:r>
+    </w:p>
+    <w:p>
+      <w:pPr>
+        <w:numPr>
+          <w:ilvl w:val="1"/>
+          <w:numId w:val="1007"/>
+        </w:numPr>
+        <w:pStyle w:val="Compact"/>
+      </w:pPr>
+      <w:r>
+        <w:rPr>
+          <w:bCs/>
+          <w:b/>
+        </w:rPr>
+        <w:t xml:space="preserve">HTML の Web アプリとして使う場合</w:t>
+      </w:r>
+      <w:r>
+        <w:t xml:space="preserve">：</w:t>
+      </w:r>
+      <w:r>
+        <w:rPr>
+          <w:rStyle w:val="VerbatimChar"/>
+        </w:rPr>
+        <w:t xml:space="preserve">doGet</w:t>
+      </w:r>
+      <w:r>
+        <w:t xml:space="preserve">／</w:t>
+      </w:r>
+      <w:r>
+        <w:rPr>
+          <w:rStyle w:val="VerbatimChar"/>
+        </w:rPr>
+        <w:t xml:space="preserve">doPost</w:t>
+      </w:r>
+      <w:r>
+        <w:t xml:space="preserve"> </w:t>
+      </w:r>
+      <w:r>
+        <w:t xml:space="preserve">と HTML ファイル（</w:t>
+      </w:r>
+      <w:r>
+        <w:rPr>
+          <w:rStyle w:val="VerbatimChar"/>
+        </w:rPr>
+        <w:t xml:space="preserve">HtmlService</w:t>
+      </w:r>
+      <w:r>
+        <w:t xml:space="preserve">）を用意し、右上の</w:t>
+      </w:r>
+      <w:r>
+        <w:t xml:space="preserve"> </w:t>
+      </w:r>
+      <w:r>
+        <w:rPr>
+          <w:bCs/>
+          <w:b/>
+        </w:rPr>
+        <w:t xml:space="preserve">「デプロイ」→「新しいデプロイ」→「ウェブアプリ」</w:t>
+      </w:r>
+      <w:r>
+        <w:t xml:space="preserve"> </w:t>
+      </w:r>
+      <w:r>
+        <w:t xml:space="preserve">で公開する。</w:t>
+      </w:r>
+      <w:r>
+        <w:rPr>
+          <w:bCs/>
+          <w:b/>
+        </w:rPr>
+        <w:t xml:space="preserve">「アクセスできるユーザー」の範囲は必ず絞る</w:t>
+      </w:r>
+      <w:r>
+        <w:t xml:space="preserve">（「3. 社内ルール」参照）</w:t>
       </w:r>
     </w:p>
     <w:p>
       <w:pPr>
         <w:numPr>
           <w:ilvl w:val="0"/>
-          <w:numId w:val="1005"/>
+          <w:numId w:val="1006"/>
         </w:numPr>
         <w:pStyle w:val="Compact"/>
       </w:pPr>
@@ -1131,8 +1496,8 @@
         <w:t xml:space="preserve">でください（「3. 社内ルール」参照）。</w:t>
       </w:r>
     </w:p>
-    <w:bookmarkEnd w:id="25"/>
-    <w:bookmarkStart w:id="28" w:name="X5415bc33db2f3db5ee6303f6a284f7a49620668"/>
+    <w:bookmarkEnd w:id="27"/>
+    <w:bookmarkStart w:id="30" w:name="X5415bc33db2f3db5ee6303f6a284f7a49620668"/>
     <w:p>
       <w:pPr>
         <w:pStyle w:val="Heading3"/>
@@ -1328,7 +1693,7 @@
       <w:pPr>
         <w:numPr>
           <w:ilvl w:val="0"/>
-          <w:numId w:val="1006"/>
+          <w:numId w:val="1008"/>
         </w:numPr>
         <w:pStyle w:val="Compact"/>
       </w:pPr>
@@ -1360,7 +1725,7 @@
       <w:pPr>
         <w:numPr>
           <w:ilvl w:val="0"/>
-          <w:numId w:val="1006"/>
+          <w:numId w:val="1008"/>
         </w:numPr>
         <w:pStyle w:val="Compact"/>
       </w:pPr>
@@ -1398,7 +1763,7 @@
       <w:r>
         <w:t xml:space="preserve"> </w:t>
       </w:r>
-      <w:hyperlink r:id="rId26">
+      <w:hyperlink r:id="rId28">
         <w:r>
           <w:rPr>
             <w:rStyle w:val="Hyperlink"/>
@@ -1415,7 +1780,7 @@
       <w:r>
         <w:t xml:space="preserve"> </w:t>
       </w:r>
-      <w:hyperlink r:id="rId27">
+      <w:hyperlink r:id="rId29">
         <w:r>
           <w:rPr>
             <w:rStyle w:val="Hyperlink"/>
@@ -1430,14 +1795,80 @@
         <w:t xml:space="preserve">を参照。不明な場合は上長へ確認してください。</w:t>
       </w:r>
     </w:p>
-    <w:bookmarkEnd w:id="28"/>
-    <w:bookmarkStart w:id="29" w:name="X14cbdaa10eeb032f6647251c3f735af2d07b89f"/>
+    <w:bookmarkEnd w:id="30"/>
+    <w:bookmarkStart w:id="32" w:name="X14cbdaa10eeb032f6647251c3f735af2d07b89f"/>
     <w:p>
       <w:pPr>
         <w:pStyle w:val="Heading3"/>
       </w:pPr>
       <w:r>
         <w:t xml:space="preserve">2-6. どちらを使うべきか（使い分けの目安）</w:t>
+      </w:r>
+    </w:p>
+    <w:p>
+      <w:pPr>
+        <w:pStyle w:val="FirstParagraph"/>
+      </w:pPr>
+      <w:r>
+        <w:t xml:space="preserve">まず、GAS には</w:t>
+      </w:r>
+      <w:r>
+        <w:t xml:space="preserve"> </w:t>
+      </w:r>
+      <w:r>
+        <w:rPr>
+          <w:bCs/>
+          <w:b/>
+        </w:rPr>
+        <w:t xml:space="preserve">(A) 自動化</w:t>
+      </w:r>
+      <w:r>
+        <w:t xml:space="preserve"> </w:t>
+      </w:r>
+      <w:r>
+        <w:t xml:space="preserve">と</w:t>
+      </w:r>
+      <w:r>
+        <w:t xml:space="preserve"> </w:t>
+      </w:r>
+      <w:r>
+        <w:rPr>
+          <w:bCs/>
+          <w:b/>
+        </w:rPr>
+        <w:t xml:space="preserve">(B) HTML の Web アプリ</w:t>
+      </w:r>
+      <w:r>
+        <w:t xml:space="preserve"> </w:t>
+      </w:r>
+      <w:r>
+        <w:t xml:space="preserve">の 2 つの使い方があることを踏まえて選びます。「画面のあるアプリ」は AppSheet と</w:t>
+      </w:r>
+      <w:r>
+        <w:t xml:space="preserve"> </w:t>
+      </w:r>
+      <w:r>
+        <w:rPr>
+          <w:bCs/>
+          <w:b/>
+        </w:rPr>
+        <w:t xml:space="preserve">GAS の Web アプリ（B）</w:t>
+      </w:r>
+      <w:r>
+        <w:t xml:space="preserve"> </w:t>
+      </w:r>
+      <w:r>
+        <w:t xml:space="preserve">のどちらでも作れますが、</w:t>
+      </w:r>
+      <w:r>
+        <w:rPr>
+          <w:bCs/>
+          <w:b/>
+        </w:rPr>
+        <w:t xml:space="preserve">得意分野が異なります</w:t>
+      </w:r>
+      <w:r>
+        <w:t xml:space="preserve">。</w:t>
       </w:r>
     </w:p>
     <w:tbl>
@@ -1539,7 +1970,7 @@
               <w:t xml:space="preserve">写真を撮って報告</w:t>
             </w:r>
             <w:r>
-              <w:t xml:space="preserve">させたい</w:t>
+              <w:t xml:space="preserve">させたい／スマホアプリとして使いたい</w:t>
             </w:r>
           </w:p>
         </w:tc>
@@ -1569,7 +2000,7 @@
               <w:jc w:val="left"/>
             </w:pPr>
             <w:r>
-              <w:t xml:space="preserve">プログラミングは避けたい／現場の人が使う</w:t>
+              <w:t xml:space="preserve">プログラミングは避けたい／現場の人が手早く作る</w:t>
             </w:r>
           </w:p>
         </w:tc>
@@ -1625,7 +2056,7 @@
                 <w:bCs/>
                 <w:b/>
               </w:rPr>
-              <w:t xml:space="preserve">GAS</w:t>
+              <w:t xml:space="preserve">GAS（自動化）</w:t>
             </w:r>
           </w:p>
         </w:tc>
@@ -1665,7 +2096,54 @@
                 <w:bCs/>
                 <w:b/>
               </w:rPr>
-              <w:t xml:space="preserve">GAS</w:t>
+              <w:t xml:space="preserve">GAS（自動化）</w:t>
+            </w:r>
+          </w:p>
+        </w:tc>
+      </w:tr>
+      <w:tr>
+        <w:tc>
+          <w:tcPr/>
+          <w:p>
+            <w:pPr>
+              <w:pStyle w:val="Compact"/>
+              <w:jc w:val="left"/>
+            </w:pPr>
+            <w:r>
+              <w:rPr>
+                <w:bCs/>
+                <w:b/>
+              </w:rPr>
+              <w:t xml:space="preserve">独自デザインの画面</w:t>
+            </w:r>
+            <w:r>
+              <w:t xml:space="preserve">や、AppSheet では作りにくい</w:t>
+            </w:r>
+            <w:r>
+              <w:rPr>
+                <w:bCs/>
+                <w:b/>
+              </w:rPr>
+              <w:t xml:space="preserve">細かい入力チェック・独自ロジック</w:t>
+            </w:r>
+            <w:r>
+              <w:t xml:space="preserve">の Web ツールが欲しい</w:t>
+            </w:r>
+          </w:p>
+        </w:tc>
+        <w:tc>
+          <w:tcPr/>
+          <w:p>
+            <w:pPr>
+              <w:pStyle w:val="Compact"/>
+              <w:jc w:val="left"/>
+            </w:pPr>
+            <w:r>
+              <w:rPr>
+                <w:bCs/>
+                <w:b/>
+              </w:rPr>
+              <w:t xml:space="preserve">GAS（Web アプリ）</w:t>
             </w:r>
           </w:p>
         </w:tc>
@@ -1711,17 +2189,424 @@
         </w:tc>
       </w:tr>
     </w:tbl>
+    <w:bookmarkStart w:id="31" w:name="appsheet-とgas-の-web-アプリの違い画面のあるアプリを作る場合"/>
+    <w:p>
+      <w:pPr>
+        <w:pStyle w:val="Heading4"/>
+      </w:pPr>
+      <w:r>
+        <w:t xml:space="preserve">AppSheet と「GAS の Web アプリ」の違い（画面のあるアプリを作る場合）</w:t>
+      </w:r>
+    </w:p>
+    <w:tbl>
+      <w:tblPr>
+        <w:tblStyle w:val="Table"/>
+        <w:tblW w:type="auto" w:w="0"/>
+        <w:tblLook w:firstRow="1" w:lastRow="0" w:firstColumn="0" w:lastColumn="0" w:noHBand="0" w:noVBand="0" w:val="0020"/>
+        <w:jc w:val="start"/>
+      </w:tblPr>
+      <w:tblGrid>
+        <w:gridCol w:w="2640"/>
+        <w:gridCol w:w="2640"/>
+        <w:gridCol w:w="2640"/>
+      </w:tblGrid>
+      <w:tr>
+        <w:trPr>
+          <w:tblHeader w:val="true"/>
+        </w:trPr>
+        <w:tc>
+          <w:tcPr/>
+          <w:p>
+            <w:pPr>
+              <w:pStyle w:val="Compact"/>
+              <w:jc w:val="left"/>
+            </w:pPr>
+            <w:r>
+              <w:t xml:space="preserve">観点</w:t>
+            </w:r>
+          </w:p>
+        </w:tc>
+        <w:tc>
+          <w:tcPr/>
+          <w:p>
+            <w:pPr>
+              <w:pStyle w:val="Compact"/>
+              <w:jc w:val="left"/>
+            </w:pPr>
+            <w:r>
+              <w:t xml:space="preserve">AppSheet</w:t>
+            </w:r>
+          </w:p>
+        </w:tc>
+        <w:tc>
+          <w:tcPr/>
+          <w:p>
+            <w:pPr>
+              <w:pStyle w:val="Compact"/>
+              <w:jc w:val="left"/>
+            </w:pPr>
+            <w:r>
+              <w:t xml:space="preserve">GAS の Web アプリ（HTML）</w:t>
+            </w:r>
+          </w:p>
+        </w:tc>
+      </w:tr>
+      <w:tr>
+        <w:tc>
+          <w:tcPr/>
+          <w:p>
+            <w:pPr>
+              <w:pStyle w:val="Compact"/>
+              <w:jc w:val="left"/>
+            </w:pPr>
+            <w:r>
+              <w:rPr>
+                <w:bCs/>
+                <w:b/>
+              </w:rPr>
+              <w:t xml:space="preserve">作り方</w:t>
+            </w:r>
+          </w:p>
+        </w:tc>
+        <w:tc>
+          <w:tcPr/>
+          <w:p>
+            <w:pPr>
+              <w:pStyle w:val="Compact"/>
+              <w:jc w:val="left"/>
+            </w:pPr>
+            <w:r>
+              <w:t xml:space="preserve">ノーコード（設定中心）</w:t>
+            </w:r>
+          </w:p>
+        </w:tc>
+        <w:tc>
+          <w:tcPr/>
+          <w:p>
+            <w:pPr>
+              <w:pStyle w:val="Compact"/>
+              <w:jc w:val="left"/>
+            </w:pPr>
+            <w:r>
+              <w:t xml:space="preserve">HTML／CSS／JavaScript を書く（要プログラミング）</w:t>
+            </w:r>
+          </w:p>
+        </w:tc>
+      </w:tr>
+      <w:tr>
+        <w:tc>
+          <w:tcPr/>
+          <w:p>
+            <w:pPr>
+              <w:pStyle w:val="Compact"/>
+              <w:jc w:val="left"/>
+            </w:pPr>
+            <w:r>
+              <w:rPr>
+                <w:bCs/>
+                <w:b/>
+              </w:rPr>
+              <w:t xml:space="preserve">作る速さ</w:t>
+            </w:r>
+          </w:p>
+        </w:tc>
+        <w:tc>
+          <w:tcPr/>
+          <w:p>
+            <w:pPr>
+              <w:pStyle w:val="Compact"/>
+              <w:jc w:val="left"/>
+            </w:pPr>
+            <w:r>
+              <w:t xml:space="preserve">速い（自動生成）</w:t>
+            </w:r>
+          </w:p>
+        </w:tc>
+        <w:tc>
+          <w:tcPr/>
+          <w:p>
+            <w:pPr>
+              <w:pStyle w:val="Compact"/>
+              <w:jc w:val="left"/>
+            </w:pPr>
+            <w:r>
+              <w:t xml:space="preserve">画面を自分で作るぶん手間がかかる</w:t>
+            </w:r>
+          </w:p>
+        </w:tc>
+      </w:tr>
+      <w:tr>
+        <w:tc>
+          <w:tcPr/>
+          <w:p>
+            <w:pPr>
+              <w:pStyle w:val="Compact"/>
+              <w:jc w:val="left"/>
+            </w:pPr>
+            <w:r>
+              <w:rPr>
+                <w:bCs/>
+                <w:b/>
+              </w:rPr>
+              <w:t xml:space="preserve">画面の自由度</w:t>
+            </w:r>
+          </w:p>
+        </w:tc>
+        <w:tc>
+          <w:tcPr/>
+          <w:p>
+            <w:pPr>
+              <w:pStyle w:val="Compact"/>
+              <w:jc w:val="left"/>
+            </w:pPr>
+            <w:r>
+              <w:t xml:space="preserve">テンプレートの範囲内</w:t>
+            </w:r>
+          </w:p>
+        </w:tc>
+        <w:tc>
+          <w:tcPr/>
+          <w:p>
+            <w:pPr>
+              <w:pStyle w:val="Compact"/>
+              <w:jc w:val="left"/>
+            </w:pPr>
+            <w:r>
+              <w:rPr>
+                <w:bCs/>
+                <w:b/>
+              </w:rPr>
+              <w:t xml:space="preserve">高い（レイアウトを自由に作れる）</w:t>
+            </w:r>
+          </w:p>
+        </w:tc>
+      </w:tr>
+      <w:tr>
+        <w:tc>
+          <w:tcPr/>
+          <w:p>
+            <w:pPr>
+              <w:pStyle w:val="Compact"/>
+              <w:jc w:val="left"/>
+            </w:pPr>
+            <w:r>
+              <w:rPr>
+                <w:bCs/>
+                <w:b/>
+              </w:rPr>
+              <w:t xml:space="preserve">スマホでの使い勝手</w:t>
+            </w:r>
+          </w:p>
+        </w:tc>
+        <w:tc>
+          <w:tcPr/>
+          <w:p>
+            <w:pPr>
+              <w:pStyle w:val="Compact"/>
+              <w:jc w:val="left"/>
+            </w:pPr>
+            <w:r>
+              <w:t xml:space="preserve">◎ 専用アプリ・オフライン・写真/位置情報に強い</w:t>
+            </w:r>
+          </w:p>
+        </w:tc>
+        <w:tc>
+          <w:tcPr/>
+          <w:p>
+            <w:pPr>
+              <w:pStyle w:val="Compact"/>
+              <w:jc w:val="left"/>
+            </w:pPr>
+            <w:r>
+              <w:t xml:space="preserve">△ ブラウザ表示（凝った作りは自分次第）</w:t>
+            </w:r>
+          </w:p>
+        </w:tc>
+      </w:tr>
+      <w:tr>
+        <w:tc>
+          <w:tcPr/>
+          <w:p>
+            <w:pPr>
+              <w:pStyle w:val="Compact"/>
+              <w:jc w:val="left"/>
+            </w:pPr>
+            <w:r>
+              <w:rPr>
+                <w:bCs/>
+                <w:b/>
+              </w:rPr>
+              <w:t xml:space="preserve">細かい独自ロジック</w:t>
+            </w:r>
+          </w:p>
+        </w:tc>
+        <w:tc>
+          <w:tcPr/>
+          <w:p>
+            <w:pPr>
+              <w:pStyle w:val="Compact"/>
+              <w:jc w:val="left"/>
+            </w:pPr>
+            <w:r>
+              <w:t xml:space="preserve">苦手な処理もある</w:t>
+            </w:r>
+          </w:p>
+        </w:tc>
+        <w:tc>
+          <w:tcPr/>
+          <w:p>
+            <w:pPr>
+              <w:pStyle w:val="Compact"/>
+              <w:jc w:val="left"/>
+            </w:pPr>
+            <w:r>
+              <w:rPr>
+                <w:bCs/>
+                <w:b/>
+              </w:rPr>
+              <w:t xml:space="preserve">得意（自由に書ける）</w:t>
+            </w:r>
+          </w:p>
+        </w:tc>
+      </w:tr>
+      <w:tr>
+        <w:tc>
+          <w:tcPr/>
+          <w:p>
+            <w:pPr>
+              <w:pStyle w:val="Compact"/>
+              <w:jc w:val="left"/>
+            </w:pPr>
+            <w:r>
+              <w:rPr>
+                <w:bCs/>
+                <w:b/>
+              </w:rPr>
+              <w:t xml:space="preserve">メンテ・引き継ぎ</w:t>
+            </w:r>
+          </w:p>
+        </w:tc>
+        <w:tc>
+          <w:tcPr/>
+          <w:p>
+            <w:pPr>
+              <w:pStyle w:val="Compact"/>
+              <w:jc w:val="left"/>
+            </w:pPr>
+            <w:r>
+              <w:t xml:space="preserve">設定なので比較的引き継ぎやすい</w:t>
+            </w:r>
+          </w:p>
+        </w:tc>
+        <w:tc>
+          <w:tcPr/>
+          <w:p>
+            <w:pPr>
+              <w:pStyle w:val="Compact"/>
+              <w:jc w:val="left"/>
+            </w:pPr>
+            <w:r>
+              <w:t xml:space="preserve">コード理解が必要で</w:t>
+            </w:r>
+            <w:r>
+              <w:rPr>
+                <w:bCs/>
+                <w:b/>
+              </w:rPr>
+              <w:t xml:space="preserve">属人化しやすい</w:t>
+            </w:r>
+          </w:p>
+        </w:tc>
+      </w:tr>
+      <w:tr>
+        <w:tc>
+          <w:tcPr/>
+          <w:p>
+            <w:pPr>
+              <w:pStyle w:val="Compact"/>
+              <w:jc w:val="left"/>
+            </w:pPr>
+            <w:r>
+              <w:rPr>
+                <w:bCs/>
+                <w:b/>
+              </w:rPr>
+              <w:t xml:space="preserve">向いている人</w:t>
+            </w:r>
+          </w:p>
+        </w:tc>
+        <w:tc>
+          <w:tcPr/>
+          <w:p>
+            <w:pPr>
+              <w:pStyle w:val="Compact"/>
+              <w:jc w:val="left"/>
+            </w:pPr>
+            <w:r>
+              <w:t xml:space="preserve">現場担当・非エンジニア</w:t>
+            </w:r>
+          </w:p>
+        </w:tc>
+        <w:tc>
+          <w:tcPr/>
+          <w:p>
+            <w:pPr>
+              <w:pStyle w:val="Compact"/>
+              <w:jc w:val="left"/>
+            </w:pPr>
+            <w:r>
+              <w:t xml:space="preserve">コードを書ける担当</w:t>
+            </w:r>
+          </w:p>
+        </w:tc>
+      </w:tr>
+    </w:tbl>
     <w:p>
       <w:pPr>
         <w:pStyle w:val="BlockText"/>
       </w:pPr>
       <w:r>
-        <w:t xml:space="preserve">💡 両者は組み合わせられます。例：AppSheet で現場が入力 → スプレッドシートに蓄積 → GAS が毎朝集計して本部に Chat 通知、という連携も可能です。</w:t>
-      </w:r>
-    </w:p>
-    <w:bookmarkEnd w:id="29"/>
-    <w:bookmarkEnd w:id="30"/>
-    <w:bookmarkStart w:id="32" w:name="Xae66e37a66111d30bd9c5fc6c7733688af0dd66"/>
+        <w:t xml:space="preserve">💡</w:t>
+      </w:r>
+      <w:r>
+        <w:t xml:space="preserve"> </w:t>
+      </w:r>
+      <w:r>
+        <w:rPr>
+          <w:bCs/>
+          <w:b/>
+        </w:rPr>
+        <w:t xml:space="preserve">迷ったらまず AppSheet</w:t>
+      </w:r>
+      <w:r>
+        <w:t xml:space="preserve"> </w:t>
+      </w:r>
+      <w:r>
+        <w:t xml:space="preserve">を検討してください。入力・一覧・報告といった典型的な業務アプリは AppSheet の方が速く・引き継ぎやすく作れます。</w:t>
+      </w:r>
+      <w:r>
+        <w:rPr>
+          <w:bCs/>
+          <w:b/>
+        </w:rPr>
+        <w:t xml:space="preserve">AppSheet では実現できない独自画面・独自ロジックが必要なときだけ、GAS の Web アプリ</w:t>
+      </w:r>
+      <w:r>
+        <w:t xml:space="preserve">を選ぶのが目安です。</w:t>
+      </w:r>
+    </w:p>
+    <w:p>
+      <w:pPr>
+        <w:pStyle w:val="BlockText"/>
+      </w:pPr>
+      <w:r>
+        <w:t xml:space="preserve">💡 両者・両用途は組み合わせられます。例：AppSheet で現場が入力 → スプレッドシートに蓄積 → GAS（自動化）が毎朝集計して本部に Chat 通知。あるいは GAS の Web アプリで受け付けた申請をスプレッドシートに記録し、GAS の自動化で承認者へ通知、といった連携も可能です。</w:t>
+      </w:r>
+    </w:p>
+    <w:bookmarkEnd w:id="31"/>
+    <w:bookmarkEnd w:id="32"/>
+    <w:bookmarkEnd w:id="33"/>
+    <w:bookmarkStart w:id="35" w:name="Xae66e37a66111d30bd9c5fc6c7733688af0dd66"/>
     <w:p>
       <w:pPr>
         <w:pStyle w:val="Heading2"/>
@@ -1742,7 +2627,7 @@
       <w:pPr>
         <w:numPr>
           <w:ilvl w:val="0"/>
-          <w:numId w:val="1007"/>
+          <w:numId w:val="1009"/>
         </w:numPr>
         <w:pStyle w:val="Compact"/>
       </w:pPr>
@@ -1758,7 +2643,7 @@
       <w:pPr>
         <w:numPr>
           <w:ilvl w:val="1"/>
-          <w:numId w:val="1008"/>
+          <w:numId w:val="1010"/>
         </w:numPr>
         <w:pStyle w:val="Compact"/>
       </w:pPr>
@@ -1777,7 +2662,7 @@
       <w:pPr>
         <w:numPr>
           <w:ilvl w:val="1"/>
-          <w:numId w:val="1008"/>
+          <w:numId w:val="1010"/>
         </w:numPr>
         <w:pStyle w:val="Compact"/>
       </w:pPr>
@@ -1796,7 +2681,7 @@
       <w:pPr>
         <w:numPr>
           <w:ilvl w:val="1"/>
-          <w:numId w:val="1008"/>
+          <w:numId w:val="1010"/>
         </w:numPr>
         <w:pStyle w:val="Compact"/>
       </w:pPr>
@@ -1813,7 +2698,7 @@
       <w:r>
         <w:t xml:space="preserve">（会社の資産として残す。</w:t>
       </w:r>
-      <w:hyperlink r:id="rId31">
+      <w:hyperlink r:id="rId34">
         <w:r>
           <w:rPr>
             <w:rStyle w:val="Hyperlink"/>
@@ -1829,7 +2714,7 @@
       <w:pPr>
         <w:numPr>
           <w:ilvl w:val="1"/>
-          <w:numId w:val="1008"/>
+          <w:numId w:val="1010"/>
         </w:numPr>
         <w:pStyle w:val="Compact"/>
       </w:pPr>
@@ -1854,7 +2739,7 @@
       <w:pPr>
         <w:numPr>
           <w:ilvl w:val="1"/>
-          <w:numId w:val="1008"/>
+          <w:numId w:val="1010"/>
         </w:numPr>
         <w:pStyle w:val="Compact"/>
       </w:pPr>
@@ -1873,7 +2758,7 @@
       <w:pPr>
         <w:numPr>
           <w:ilvl w:val="1"/>
-          <w:numId w:val="1008"/>
+          <w:numId w:val="1010"/>
         </w:numPr>
         <w:pStyle w:val="Compact"/>
       </w:pPr>
@@ -1895,7 +2780,7 @@
       <w:pPr>
         <w:numPr>
           <w:ilvl w:val="1"/>
-          <w:numId w:val="1008"/>
+          <w:numId w:val="1010"/>
         </w:numPr>
         <w:pStyle w:val="Compact"/>
       </w:pPr>
@@ -1914,7 +2799,7 @@
       <w:pPr>
         <w:numPr>
           <w:ilvl w:val="1"/>
-          <w:numId w:val="1008"/>
+          <w:numId w:val="1010"/>
         </w:numPr>
         <w:pStyle w:val="Compact"/>
       </w:pPr>
@@ -1936,7 +2821,7 @@
       <w:pPr>
         <w:numPr>
           <w:ilvl w:val="0"/>
-          <w:numId w:val="1007"/>
+          <w:numId w:val="1009"/>
         </w:numPr>
         <w:pStyle w:val="Compact"/>
       </w:pPr>
@@ -1946,104 +2831,6 @@
           <w:b/>
         </w:rPr>
         <w:t xml:space="preserve">展開（配布）前の承認 ― 重要</w:t>
-      </w:r>
-    </w:p>
-    <w:p>
-      <w:pPr>
-        <w:numPr>
-          <w:ilvl w:val="1"/>
-          <w:numId w:val="1009"/>
-        </w:numPr>
-        <w:pStyle w:val="Compact"/>
-      </w:pPr>
-      <w:r>
-        <w:t xml:space="preserve">次のいずれかに当てはまる AppSheet／GAS のアプリは、</w:t>
-      </w:r>
-      <w:r>
-        <w:rPr>
-          <w:bCs/>
-          <w:b/>
-        </w:rPr>
-        <w:t xml:space="preserve">必ず上長、ならびにコミットメント等で社長の承認を得たうえで展開（配布・本番運用）する</w:t>
-      </w:r>
-      <w:r>
-        <w:t xml:space="preserve">こと。</w:t>
-      </w:r>
-    </w:p>
-    <w:p>
-      <w:pPr>
-        <w:numPr>
-          <w:ilvl w:val="2"/>
-          <w:numId w:val="1010"/>
-        </w:numPr>
-        <w:pStyle w:val="Compact"/>
-      </w:pPr>
-      <w:r>
-        <w:rPr>
-          <w:bCs/>
-          <w:b/>
-        </w:rPr>
-        <w:t xml:space="preserve">個人情報を取り扱う</w:t>
-      </w:r>
-      <w:r>
-        <w:t xml:space="preserve">場合（従業員情報、顧客情報、クレーム情報など）</w:t>
-      </w:r>
-    </w:p>
-    <w:p>
-      <w:pPr>
-        <w:numPr>
-          <w:ilvl w:val="2"/>
-          <w:numId w:val="1010"/>
-        </w:numPr>
-        <w:pStyle w:val="Compact"/>
-      </w:pPr>
-      <w:r>
-        <w:t xml:space="preserve">アプリに</w:t>
-      </w:r>
-      <w:r>
-        <w:rPr>
-          <w:bCs/>
-          <w:b/>
-        </w:rPr>
-        <w:t xml:space="preserve">登録した情報が漏洩した際に、会社にリスクが生じる</w:t>
-      </w:r>
-      <w:r>
-        <w:t xml:space="preserve">ような場合（機密情報・信用・法的責任に関わる情報など）</w:t>
-      </w:r>
-    </w:p>
-    <w:p>
-      <w:pPr>
-        <w:numPr>
-          <w:ilvl w:val="1"/>
-          <w:numId w:val="1009"/>
-        </w:numPr>
-        <w:pStyle w:val="Compact"/>
-      </w:pPr>
-      <w:r>
-        <w:t xml:space="preserve">承認を得る前に、対象アプリを</w:t>
-      </w:r>
-      <w:r>
-        <w:rPr>
-          <w:bCs/>
-          <w:b/>
-        </w:rPr>
-        <w:t xml:space="preserve">利用者へ配布したり本番運用を開始したりしない</w:t>
-      </w:r>
-    </w:p>
-    <w:p>
-      <w:pPr>
-        <w:numPr>
-          <w:ilvl w:val="0"/>
-          <w:numId w:val="1007"/>
-        </w:numPr>
-        <w:pStyle w:val="Compact"/>
-      </w:pPr>
-      <w:r>
-        <w:rPr>
-          <w:bCs/>
-          <w:b/>
-        </w:rPr>
-        <w:t xml:space="preserve">漏洩するとマズいデータを扱うアプリのアクセス制限 ― 重要</w:t>
       </w:r>
     </w:p>
     <w:p>
@@ -2055,24 +2842,58 @@
         <w:pStyle w:val="Compact"/>
       </w:pPr>
       <w:r>
-        <w:rPr>
-          <w:bCs/>
-          <w:b/>
-        </w:rPr>
-        <w:t xml:space="preserve">全員が会社アカウントを持っているわけではない</w:t>
-      </w:r>
-      <w:r>
-        <w:t xml:space="preserve">ため、「会社アカウントでのサインイン必須」だけでは閲覧を制御しきれない。そのため、</w:t>
-      </w:r>
-      <w:r>
-        <w:rPr>
-          <w:bCs/>
-          <w:b/>
-        </w:rPr>
-        <w:t xml:space="preserve">個人情報や機密情報を取り扱うアプリの場合は、パスワード等で閲覧を制御する設計にする</w:t>
+        <w:t xml:space="preserve">次のいずれかに当てはまる AppSheet／GAS のアプリは、</w:t>
+      </w:r>
+      <w:r>
+        <w:rPr>
+          <w:bCs/>
+          <w:b/>
+        </w:rPr>
+        <w:t xml:space="preserve">必ず上長、ならびにコミットメント等で社長の承認を得たうえで展開（配布・本番運用）する</w:t>
       </w:r>
       <w:r>
         <w:t xml:space="preserve">こと。</w:t>
+      </w:r>
+    </w:p>
+    <w:p>
+      <w:pPr>
+        <w:numPr>
+          <w:ilvl w:val="2"/>
+          <w:numId w:val="1012"/>
+        </w:numPr>
+        <w:pStyle w:val="Compact"/>
+      </w:pPr>
+      <w:r>
+        <w:rPr>
+          <w:bCs/>
+          <w:b/>
+        </w:rPr>
+        <w:t xml:space="preserve">個人情報を取り扱う</w:t>
+      </w:r>
+      <w:r>
+        <w:t xml:space="preserve">場合（従業員情報、顧客情報、クレーム情報など）</w:t>
+      </w:r>
+    </w:p>
+    <w:p>
+      <w:pPr>
+        <w:numPr>
+          <w:ilvl w:val="2"/>
+          <w:numId w:val="1012"/>
+        </w:numPr>
+        <w:pStyle w:val="Compact"/>
+      </w:pPr>
+      <w:r>
+        <w:t xml:space="preserve">アプリに</w:t>
+      </w:r>
+      <w:r>
+        <w:rPr>
+          <w:bCs/>
+          <w:b/>
+        </w:rPr>
+        <w:t xml:space="preserve">登録した情報が漏洩した際に、会社にリスクが生じる</w:t>
+      </w:r>
+      <w:r>
+        <w:t xml:space="preserve">ような場合（機密情報・信用・法的責任に関わる情報など）</w:t>
       </w:r>
     </w:p>
     <w:p>
@@ -2084,126 +2905,30 @@
         <w:pStyle w:val="Compact"/>
       </w:pPr>
       <w:r>
-        <w:t xml:space="preserve">漏洩すると会社にリスクが生じるデータ（個人情報・機密情報など）を扱うアプリは、</w:t>
-      </w:r>
-      <w:r>
-        <w:rPr>
-          <w:bCs/>
-          <w:b/>
-        </w:rPr>
-        <w:t xml:space="preserve">「リンクを知っている全員」が閲覧できる状態にせず、パスワード等のアクセス制限を設計に組み込んだうえで展開する</w:t>
-      </w:r>
-      <w:r>
-        <w:t xml:space="preserve">。</w:t>
-      </w:r>
-    </w:p>
-    <w:p>
-      <w:pPr>
-        <w:numPr>
-          <w:ilvl w:val="2"/>
-          <w:numId w:val="1012"/>
-        </w:numPr>
-        <w:pStyle w:val="Compact"/>
-      </w:pPr>
-      <w:r>
-        <w:t xml:space="preserve">AppSheet：共有は**「Users」タブで特定の利用者を指定**する。アカウントを持たない利用者が使う場合は、</w:t>
-      </w:r>
-      <w:r>
-        <w:rPr>
-          <w:bCs/>
-          <w:b/>
-        </w:rPr>
-        <w:t xml:space="preserve">パスワード（合言葉）入力などの閲覧制御を設計に組み込む</w:t>
-      </w:r>
-      <w:r>
-        <w:t xml:space="preserve">。「リンクを知っている全員」での公開はしない。</w:t>
-      </w:r>
-    </w:p>
-    <w:p>
-      <w:pPr>
-        <w:numPr>
-          <w:ilvl w:val="2"/>
-          <w:numId w:val="1012"/>
-        </w:numPr>
-        <w:pStyle w:val="Compact"/>
-      </w:pPr>
-      <w:r>
-        <w:t xml:space="preserve">GAS の Web アプリ（</w:t>
-      </w:r>
-      <w:r>
-        <w:rPr>
-          <w:rStyle w:val="VerbatimChar"/>
-        </w:rPr>
-        <w:t xml:space="preserve">doGet</w:t>
-      </w:r>
-      <w:r>
-        <w:t xml:space="preserve">/</w:t>
-      </w:r>
-      <w:r>
-        <w:rPr>
-          <w:rStyle w:val="VerbatimChar"/>
-        </w:rPr>
-        <w:t xml:space="preserve">doPost</w:t>
-      </w:r>
-      <w:r>
-        <w:t xml:space="preserve"> </w:t>
-      </w:r>
-      <w:r>
-        <w:t xml:space="preserve">で公開する場合）：アクセス権を**「全員（匿名含む）」にしない**。会社アカウントでの制限が使えない相手向けには、</w:t>
-      </w:r>
-      <w:r>
-        <w:rPr>
-          <w:bCs/>
-          <w:b/>
-        </w:rPr>
-        <w:t xml:space="preserve">パスワード等での認証を設計に組み込む</w:t>
-      </w:r>
-      <w:r>
-        <w:t xml:space="preserve">。</w:t>
-      </w:r>
-    </w:p>
-    <w:p>
-      <w:pPr>
-        <w:numPr>
-          <w:ilvl w:val="2"/>
-          <w:numId w:val="1012"/>
-        </w:numPr>
-        <w:pStyle w:val="Compact"/>
-      </w:pPr>
-      <w:r>
-        <w:t xml:space="preserve">データ源のスプレッドシート等も、**「特定の人を指定」**で共有し、パスワード保護や共有ドライブの権限で閲覧範囲を絞る。</w:t>
-      </w:r>
-    </w:p>
-    <w:p>
-      <w:pPr>
-        <w:numPr>
-          <w:ilvl w:val="1"/>
-          <w:numId w:val="1011"/>
-        </w:numPr>
-        <w:pStyle w:val="Compact"/>
-      </w:pPr>
-      <w:r>
-        <w:rPr>
-          <w:bCs/>
-          <w:b/>
-        </w:rPr>
-        <w:t xml:space="preserve">誰でもリンクだけで開ける状態のまま、機密データを扱うアプリを配布しない</w:t>
+        <w:t xml:space="preserve">承認を得る前に、対象アプリを</w:t>
+      </w:r>
+      <w:r>
+        <w:rPr>
+          <w:bCs/>
+          <w:b/>
+        </w:rPr>
+        <w:t xml:space="preserve">利用者へ配布したり本番運用を開始したりしない</w:t>
       </w:r>
     </w:p>
     <w:p>
       <w:pPr>
         <w:numPr>
           <w:ilvl w:val="0"/>
-          <w:numId w:val="1007"/>
-        </w:numPr>
-        <w:pStyle w:val="Compact"/>
-      </w:pPr>
-      <w:r>
-        <w:rPr>
-          <w:bCs/>
-          <w:b/>
-        </w:rPr>
-        <w:t xml:space="preserve">やってはいけないこと</w:t>
+          <w:numId w:val="1009"/>
+        </w:numPr>
+        <w:pStyle w:val="Compact"/>
+      </w:pPr>
+      <w:r>
+        <w:rPr>
+          <w:bCs/>
+          <w:b/>
+        </w:rPr>
+        <w:t xml:space="preserve">漏洩するとマズいデータを扱うアプリのアクセス制限 ― 重要</w:t>
       </w:r>
     </w:p>
     <w:p>
@@ -2215,20 +2940,24 @@
         <w:pStyle w:val="Compact"/>
       </w:pPr>
       <w:r>
-        <w:t xml:space="preserve">個人の</w:t>
-      </w:r>
-      <w:r>
-        <w:t xml:space="preserve"> </w:t>
-      </w:r>
-      <w:r>
-        <w:rPr>
-          <w:bCs/>
-          <w:b/>
-        </w:rPr>
-        <w:t xml:space="preserve">マイドライブや個人アカウント</w:t>
-      </w:r>
-      <w:r>
-        <w:t xml:space="preserve">をデータ源／保存先にしない（退職・異動で消える・引き継げない）</w:t>
+        <w:rPr>
+          <w:bCs/>
+          <w:b/>
+        </w:rPr>
+        <w:t xml:space="preserve">全員が会社アカウントを持っているわけではない</w:t>
+      </w:r>
+      <w:r>
+        <w:t xml:space="preserve">ため、「会社アカウントでのサインイン必須」だけでは閲覧を制御しきれない。そのため、</w:t>
+      </w:r>
+      <w:r>
+        <w:rPr>
+          <w:bCs/>
+          <w:b/>
+        </w:rPr>
+        <w:t xml:space="preserve">個人情報や機密情報を取り扱うアプリの場合は、パスワード等で閲覧を制御する設計にする</w:t>
+      </w:r>
+      <w:r>
+        <w:t xml:space="preserve">こと。</w:t>
       </w:r>
     </w:p>
     <w:p>
@@ -2240,21 +2969,94 @@
         <w:pStyle w:val="Compact"/>
       </w:pPr>
       <w:r>
-        <w:rPr>
-          <w:bCs/>
-          <w:b/>
-        </w:rPr>
-        <w:t xml:space="preserve">個人情報・機密情報</w:t>
-      </w:r>
-      <w:r>
-        <w:t xml:space="preserve">（従業員情報、クレーム、顧客情報など）を扱うアプリを、</w:t>
-      </w:r>
-      <w:r>
-        <w:rPr>
-          <w:bCs/>
-          <w:b/>
-        </w:rPr>
-        <w:t xml:space="preserve">上長・社長の承認なしで展開しない</w:t>
+        <w:t xml:space="preserve">漏洩すると会社にリスクが生じるデータ（個人情報・機密情報など）を扱うアプリは、</w:t>
+      </w:r>
+      <w:r>
+        <w:rPr>
+          <w:bCs/>
+          <w:b/>
+        </w:rPr>
+        <w:t xml:space="preserve">「リンクを知っている全員」が閲覧できる状態にせず、パスワード等のアクセス制限を設計に組み込んだうえで展開する</w:t>
+      </w:r>
+      <w:r>
+        <w:t xml:space="preserve">。</w:t>
+      </w:r>
+    </w:p>
+    <w:p>
+      <w:pPr>
+        <w:numPr>
+          <w:ilvl w:val="2"/>
+          <w:numId w:val="1014"/>
+        </w:numPr>
+        <w:pStyle w:val="Compact"/>
+      </w:pPr>
+      <w:r>
+        <w:t xml:space="preserve">AppSheet：共有は**「Users」タブで特定の利用者を指定**する。アカウントを持たない利用者が使う場合は、</w:t>
+      </w:r>
+      <w:r>
+        <w:rPr>
+          <w:bCs/>
+          <w:b/>
+        </w:rPr>
+        <w:t xml:space="preserve">パスワード（合言葉）入力などの閲覧制御を設計に組み込む</w:t>
+      </w:r>
+      <w:r>
+        <w:t xml:space="preserve">。「リンクを知っている全員」での公開はしない。</w:t>
+      </w:r>
+    </w:p>
+    <w:p>
+      <w:pPr>
+        <w:numPr>
+          <w:ilvl w:val="2"/>
+          <w:numId w:val="1014"/>
+        </w:numPr>
+        <w:pStyle w:val="Compact"/>
+      </w:pPr>
+      <w:r>
+        <w:t xml:space="preserve">GAS の Web アプリ（</w:t>
+      </w:r>
+      <w:r>
+        <w:rPr>
+          <w:rStyle w:val="VerbatimChar"/>
+        </w:rPr>
+        <w:t xml:space="preserve">doGet</w:t>
+      </w:r>
+      <w:r>
+        <w:t xml:space="preserve">/</w:t>
+      </w:r>
+      <w:r>
+        <w:rPr>
+          <w:rStyle w:val="VerbatimChar"/>
+        </w:rPr>
+        <w:t xml:space="preserve">doPost</w:t>
+      </w:r>
+      <w:r>
+        <w:t xml:space="preserve"> </w:t>
+      </w:r>
+      <w:r>
+        <w:t xml:space="preserve">で公開する場合）：アクセス権を**「全員（匿名含む）」にしない**。会社アカウントでの制限が使えない相手向けには、</w:t>
+      </w:r>
+      <w:r>
+        <w:rPr>
+          <w:bCs/>
+          <w:b/>
+        </w:rPr>
+        <w:t xml:space="preserve">パスワード等での認証を設計に組み込む</w:t>
+      </w:r>
+      <w:r>
+        <w:t xml:space="preserve">。</w:t>
+      </w:r>
+    </w:p>
+    <w:p>
+      <w:pPr>
+        <w:numPr>
+          <w:ilvl w:val="2"/>
+          <w:numId w:val="1014"/>
+        </w:numPr>
+        <w:pStyle w:val="Compact"/>
+      </w:pPr>
+      <w:r>
+        <w:t xml:space="preserve">データ源のスプレッドシート等も、**「特定の人を指定」**で共有し、パスワード保護や共有ドライブの権限で閲覧範囲を絞る。</w:t>
       </w:r>
     </w:p>
     <w:p>
@@ -2266,6 +3068,89 @@
         <w:pStyle w:val="Compact"/>
       </w:pPr>
       <w:r>
+        <w:rPr>
+          <w:bCs/>
+          <w:b/>
+        </w:rPr>
+        <w:t xml:space="preserve">誰でもリンクだけで開ける状態のまま、機密データを扱うアプリを配布しない</w:t>
+      </w:r>
+    </w:p>
+    <w:p>
+      <w:pPr>
+        <w:numPr>
+          <w:ilvl w:val="0"/>
+          <w:numId w:val="1009"/>
+        </w:numPr>
+        <w:pStyle w:val="Compact"/>
+      </w:pPr>
+      <w:r>
+        <w:rPr>
+          <w:bCs/>
+          <w:b/>
+        </w:rPr>
+        <w:t xml:space="preserve">やってはいけないこと</w:t>
+      </w:r>
+    </w:p>
+    <w:p>
+      <w:pPr>
+        <w:numPr>
+          <w:ilvl w:val="1"/>
+          <w:numId w:val="1015"/>
+        </w:numPr>
+        <w:pStyle w:val="Compact"/>
+      </w:pPr>
+      <w:r>
+        <w:t xml:space="preserve">個人の</w:t>
+      </w:r>
+      <w:r>
+        <w:t xml:space="preserve"> </w:t>
+      </w:r>
+      <w:r>
+        <w:rPr>
+          <w:bCs/>
+          <w:b/>
+        </w:rPr>
+        <w:t xml:space="preserve">マイドライブや個人アカウント</w:t>
+      </w:r>
+      <w:r>
+        <w:t xml:space="preserve">をデータ源／保存先にしない（退職・異動で消える・引き継げない）</w:t>
+      </w:r>
+    </w:p>
+    <w:p>
+      <w:pPr>
+        <w:numPr>
+          <w:ilvl w:val="1"/>
+          <w:numId w:val="1015"/>
+        </w:numPr>
+        <w:pStyle w:val="Compact"/>
+      </w:pPr>
+      <w:r>
+        <w:rPr>
+          <w:bCs/>
+          <w:b/>
+        </w:rPr>
+        <w:t xml:space="preserve">個人情報・機密情報</w:t>
+      </w:r>
+      <w:r>
+        <w:t xml:space="preserve">（従業員情報、クレーム、顧客情報など）を扱うアプリを、</w:t>
+      </w:r>
+      <w:r>
+        <w:rPr>
+          <w:bCs/>
+          <w:b/>
+        </w:rPr>
+        <w:t xml:space="preserve">上長・社長の承認なしで展開しない</w:t>
+      </w:r>
+    </w:p>
+    <w:p>
+      <w:pPr>
+        <w:numPr>
+          <w:ilvl w:val="1"/>
+          <w:numId w:val="1015"/>
+        </w:numPr>
+        <w:pStyle w:val="Compact"/>
+      </w:pPr>
+      <w:r>
         <w:t xml:space="preserve">アプリやデータを</w:t>
       </w:r>
       <w:r>
@@ -2286,7 +3171,7 @@
       <w:pPr>
         <w:numPr>
           <w:ilvl w:val="1"/>
-          <w:numId w:val="1013"/>
+          <w:numId w:val="1015"/>
         </w:numPr>
         <w:pStyle w:val="Compact"/>
       </w:pPr>
@@ -2305,7 +3190,7 @@
       <w:pPr>
         <w:numPr>
           <w:ilvl w:val="1"/>
-          <w:numId w:val="1013"/>
+          <w:numId w:val="1015"/>
         </w:numPr>
         <w:pStyle w:val="Compact"/>
       </w:pPr>
@@ -2330,7 +3215,7 @@
       <w:pPr>
         <w:numPr>
           <w:ilvl w:val="0"/>
-          <w:numId w:val="1007"/>
+          <w:numId w:val="1009"/>
         </w:numPr>
         <w:pStyle w:val="Compact"/>
       </w:pPr>
@@ -2346,7 +3231,7 @@
       <w:pPr>
         <w:numPr>
           <w:ilvl w:val="1"/>
-          <w:numId w:val="1014"/>
+          <w:numId w:val="1016"/>
         </w:numPr>
         <w:pStyle w:val="Compact"/>
       </w:pPr>
@@ -2378,7 +3263,7 @@
       <w:pPr>
         <w:numPr>
           <w:ilvl w:val="1"/>
-          <w:numId w:val="1014"/>
+          <w:numId w:val="1016"/>
         </w:numPr>
         <w:pStyle w:val="Compact"/>
       </w:pPr>
@@ -2410,7 +3295,7 @@
       <w:pPr>
         <w:numPr>
           <w:ilvl w:val="1"/>
-          <w:numId w:val="1014"/>
+          <w:numId w:val="1016"/>
         </w:numPr>
         <w:pStyle w:val="Compact"/>
       </w:pPr>
@@ -2438,7 +3323,7 @@
       <w:pPr>
         <w:numPr>
           <w:ilvl w:val="1"/>
-          <w:numId w:val="1014"/>
+          <w:numId w:val="1016"/>
         </w:numPr>
         <w:pStyle w:val="Compact"/>
       </w:pPr>
@@ -2456,8 +3341,8 @@
         <w:t xml:space="preserve">上長へ相談する</w:t>
       </w:r>
     </w:p>
-    <w:bookmarkEnd w:id="32"/>
-    <w:bookmarkStart w:id="33" w:name="Xbea4cb3953046b15a77ea4b53df3baede82e7f4"/>
+    <w:bookmarkEnd w:id="35"/>
+    <w:bookmarkStart w:id="36" w:name="Xbea4cb3953046b15a77ea4b53df3baede82e7f4"/>
     <w:p>
       <w:pPr>
         <w:pStyle w:val="Heading2"/>
@@ -2832,13 +3717,93 @@
           <w:bCs/>
           <w:b/>
         </w:rPr>
+        <w:t xml:space="preserve">Q. GAS は自動化だけでなく、画面のある Web アプリも作れますか？</w:t>
+      </w:r>
+      <w:r>
+        <w:t xml:space="preserve"> </w:t>
+      </w:r>
+      <w:r>
+        <w:t xml:space="preserve">A. はい。GAS は</w:t>
+      </w:r>
+      <w:r>
+        <w:t xml:space="preserve"> </w:t>
+      </w:r>
+      <w:r>
+        <w:rPr>
+          <w:bCs/>
+          <w:b/>
+        </w:rPr>
+        <w:t xml:space="preserve">HTML／CSS で自作した画面を「Web アプリ」として URL 公開</w:t>
+      </w:r>
+      <w:r>
+        <w:t xml:space="preserve">できます（</w:t>
+      </w:r>
+      <w:r>
+        <w:rPr>
+          <w:rStyle w:val="VerbatimChar"/>
+        </w:rPr>
+        <w:t xml:space="preserve">doGet</w:t>
+      </w:r>
+      <w:r>
+        <w:t xml:space="preserve">／</w:t>
+      </w:r>
+      <w:r>
+        <w:rPr>
+          <w:rStyle w:val="VerbatimChar"/>
+        </w:rPr>
+        <w:t xml:space="preserve">doPost</w:t>
+      </w:r>
+      <w:r>
+        <w:t xml:space="preserve"> </w:t>
+      </w:r>
+      <w:r>
+        <w:t xml:space="preserve">と</w:t>
+      </w:r>
+      <w:r>
+        <w:t xml:space="preserve"> </w:t>
+      </w:r>
+      <w:r>
+        <w:rPr>
+          <w:rStyle w:val="VerbatimChar"/>
+        </w:rPr>
+        <w:t xml:space="preserve">HtmlService</w:t>
+      </w:r>
+      <w:r>
+        <w:t xml:space="preserve"> </w:t>
+      </w:r>
+      <w:r>
+        <w:t xml:space="preserve">を使用）。独自デザインの入力フォームや、AppSheet では作りにくい独自ロジックの社内ツールに向いています。ただし</w:t>
+      </w:r>
+      <w:r>
+        <w:t xml:space="preserve"> </w:t>
+      </w:r>
+      <w:r>
+        <w:rPr>
+          <w:bCs/>
+          <w:b/>
+        </w:rPr>
+        <w:t xml:space="preserve">「アクセスできるユーザー」の設定を誤ると情報漏えいにつながる</w:t>
+      </w:r>
+      <w:r>
+        <w:t xml:space="preserve">ため、匿名アクセスを許可せず、必要に応じてパスワード等の認証を設計に組み込んでください（「2-3(B)」「3. 社内ルール」参照）。</w:t>
+      </w:r>
+    </w:p>
+    <w:p>
+      <w:pPr>
+        <w:pStyle w:val="BodyText"/>
+      </w:pPr>
+      <w:r>
+        <w:rPr>
+          <w:bCs/>
+          <w:b/>
+        </w:rPr>
         <w:t xml:space="preserve">Q. AppSheet と GAS、どちらを選べばいい？</w:t>
       </w:r>
       <w:r>
         <w:t xml:space="preserve"> </w:t>
       </w:r>
       <w:r>
-        <w:t xml:space="preserve">A.</w:t>
+        <w:t xml:space="preserve">A. まず</w:t>
       </w:r>
       <w:r>
         <w:t xml:space="preserve"> </w:t>
@@ -2858,17 +3823,50 @@
           <w:bCs/>
           <w:b/>
         </w:rPr>
-        <w:t xml:space="preserve">集計・通知・メールの「自動化」なら GAS</w:t>
-      </w:r>
-      <w:r>
-        <w:t xml:space="preserve"> </w:t>
-      </w:r>
-      <w:r>
-        <w:t xml:space="preserve">が目安です（詳細は「2-6」）。両方を組み合わせることもできます。</w:t>
-      </w:r>
-    </w:p>
-    <w:bookmarkEnd w:id="33"/>
-    <w:bookmarkStart w:id="37" w:name="X80ab6edfd3e047f3553761f30998f0d377ae9ee"/>
+        <w:t xml:space="preserve">集計・通知・メールの「自動化」なら GAS（自動化）</w:t>
+      </w:r>
+      <w:r>
+        <w:t xml:space="preserve"> </w:t>
+      </w:r>
+      <w:r>
+        <w:t xml:space="preserve">が目安です。画面のあるアプリは AppSheet と</w:t>
+      </w:r>
+      <w:r>
+        <w:t xml:space="preserve"> </w:t>
+      </w:r>
+      <w:r>
+        <w:rPr>
+          <w:bCs/>
+          <w:b/>
+        </w:rPr>
+        <w:t xml:space="preserve">GAS の Web アプリ</w:t>
+      </w:r>
+      <w:r>
+        <w:t xml:space="preserve">のどちらでも作れますが、</w:t>
+      </w:r>
+      <w:r>
+        <w:rPr>
+          <w:bCs/>
+          <w:b/>
+        </w:rPr>
+        <w:t xml:space="preserve">まずは AppSheet を検討</w:t>
+      </w:r>
+      <w:r>
+        <w:t xml:space="preserve">し、</w:t>
+      </w:r>
+      <w:r>
+        <w:rPr>
+          <w:bCs/>
+          <w:b/>
+        </w:rPr>
+        <w:t xml:space="preserve">独自デザインの画面や細かい独自ロジックが必要なときだけ GAS の Web アプリ</w:t>
+      </w:r>
+      <w:r>
+        <w:t xml:space="preserve">を選んでください（詳細は「2-6」）。GAS の Web アプリはコード理解が必要で属人化しやすい点に注意します。両方を組み合わせることもできます。</w:t>
+      </w:r>
+    </w:p>
+    <w:bookmarkEnd w:id="36"/>
+    <w:bookmarkStart w:id="40" w:name="X80ab6edfd3e047f3553761f30998f0d377ae9ee"/>
     <w:p>
       <w:pPr>
         <w:pStyle w:val="Heading2"/>
@@ -2881,7 +3879,7 @@
       <w:pPr>
         <w:numPr>
           <w:ilvl w:val="0"/>
-          <w:numId w:val="1015"/>
+          <w:numId w:val="1017"/>
         </w:numPr>
         <w:pStyle w:val="Compact"/>
       </w:pPr>
@@ -2891,7 +3889,7 @@
       <w:r>
         <w:t xml:space="preserve"> </w:t>
       </w:r>
-      <w:hyperlink r:id="rId26">
+      <w:hyperlink r:id="rId28">
         <w:r>
           <w:rPr>
             <w:rStyle w:val="Hyperlink"/>
@@ -2908,7 +3906,7 @@
       <w:r>
         <w:t xml:space="preserve"> </w:t>
       </w:r>
-      <w:hyperlink r:id="rId27">
+      <w:hyperlink r:id="rId29">
         <w:r>
           <w:rPr>
             <w:rStyle w:val="Hyperlink"/>
@@ -2925,7 +3923,7 @@
       <w:r>
         <w:t xml:space="preserve"> </w:t>
       </w:r>
-      <w:hyperlink r:id="rId31">
+      <w:hyperlink r:id="rId34">
         <w:r>
           <w:rPr>
             <w:rStyle w:val="Hyperlink"/>
@@ -2938,7 +3936,7 @@
       <w:pPr>
         <w:numPr>
           <w:ilvl w:val="0"/>
-          <w:numId w:val="1015"/>
+          <w:numId w:val="1017"/>
         </w:numPr>
         <w:pStyle w:val="Compact"/>
       </w:pPr>
@@ -2950,11 +3948,11 @@
       <w:pPr>
         <w:numPr>
           <w:ilvl w:val="1"/>
-          <w:numId w:val="1016"/>
-        </w:numPr>
-        <w:pStyle w:val="Compact"/>
-      </w:pPr>
-      <w:hyperlink r:id="rId34">
+          <w:numId w:val="1018"/>
+        </w:numPr>
+        <w:pStyle w:val="Compact"/>
+      </w:pPr>
+      <w:hyperlink r:id="rId37">
         <w:r>
           <w:rPr>
             <w:rStyle w:val="Hyperlink"/>
@@ -2971,7 +3969,7 @@
       <w:r>
         <w:t xml:space="preserve"> </w:t>
       </w:r>
-      <w:hyperlink r:id="rId35">
+      <w:hyperlink r:id="rId38">
         <w:r>
           <w:rPr>
             <w:rStyle w:val="Hyperlink"/>
@@ -2984,11 +3982,11 @@
       <w:pPr>
         <w:numPr>
           <w:ilvl w:val="1"/>
-          <w:numId w:val="1016"/>
-        </w:numPr>
-        <w:pStyle w:val="Compact"/>
-      </w:pPr>
-      <w:hyperlink r:id="rId36">
+          <w:numId w:val="1018"/>
+        </w:numPr>
+        <w:pStyle w:val="Compact"/>
+      </w:pPr>
+      <w:hyperlink r:id="rId39">
         <w:r>
           <w:rPr>
             <w:rStyle w:val="Hyperlink"/>
@@ -2997,8 +3995,8 @@
         </w:r>
       </w:hyperlink>
     </w:p>
-    <w:bookmarkEnd w:id="37"/>
-    <w:bookmarkEnd w:id="38"/>
+    <w:bookmarkEnd w:id="40"/>
+    <w:bookmarkEnd w:id="41"/>
     <w:sectPr/>
   </w:body>
 </w:document>
@@ -3336,6 +4334,9 @@
     <w:abstractNumId w:val="991"/>
   </w:num>
   <w:num w:numId="1005">
+    <w:abstractNumId w:val="991"/>
+  </w:num>
+  <w:num w:numId="1006">
     <w:abstractNumId w:val="99411"/>
     <w:lvlOverride w:ilvl="0">
       <w:startOverride w:val="1"/>
@@ -3365,9 +4366,6 @@
       <w:startOverride w:val="1"/>
     </w:lvlOverride>
   </w:num>
-  <w:num w:numId="1006">
-    <w:abstractNumId w:val="991"/>
-  </w:num>
   <w:num w:numId="1007">
     <w:abstractNumId w:val="991"/>
   </w:num>
@@ -3396,6 +4394,12 @@
     <w:abstractNumId w:val="991"/>
   </w:num>
   <w:num w:numId="1016">
+    <w:abstractNumId w:val="991"/>
+  </w:num>
+  <w:num w:numId="1017">
+    <w:abstractNumId w:val="991"/>
+  </w:num>
+  <w:num w:numId="1018">
     <w:abstractNumId w:val="991"/>
   </w:num>
 </w:numbering>

</xml_diff>